<commit_message>
Add/update por data for UWTranslationNotes
</commit_message>
<xml_diff>
--- a/por/docx/08.content.docx
+++ b/por/docx/08.content.docx
@@ -10048,7 +10048,19 @@
         <w:rPr>
           <w:lang w:val="pt_PT" w:bidi="pt_PT"/>
         </w:rPr>
-        <w:t xml:space="preserve"> era uma casa temporária ou cabana de jardim no campo que fornecia sombra do sol, onde os trabalhadores podiam descansar. Tradução alternativa: "na cabana" ou "no galpão". Veja: Traduzir desconhecidos.</w:t>
+        <w:t xml:space="preserve"> era uma casa temporária ou cabana de jardim no campo que fornecia sombra do sol, onde os trabalhadores podiam descansar. Tradução alternativa: "na cabana" ou "no galpão". Veja: </w:t>
+      </w:r>
+      <w:r>
+        <w:rPr>
+          <w:lang w:val="pt_PT" w:bidi="pt_PT"/>
+        </w:rPr>
+        <w:t>Traduzir desconhecidos</w:t>
+      </w:r>
+      <w:r>
+        <w:rPr>
+          <w:lang w:val="pt_PT" w:bidi="pt_PT"/>
+        </w:rPr>
+        <w:t>.</w:t>
       </w:r>
       <w:r>
         <w:rPr>

</xml_diff>